<commit_message>
se actualiza el mr hasta su 3ra FN y se adjunta el documento de las dependencias funcionales en formato .md
</commit_message>
<xml_diff>
--- a/doc/caso/Entrega1_enunciado_unificado.docx
+++ b/doc/caso/Entrega1_enunciado_unificado.docx
@@ -148,7 +148,21 @@
           <w:sz w:val="24"/>
           <w:szCs w:val="24"/>
         </w:rPr>
-        <w:t>El local maneja cada pedido con un código de identificación único, la hora del pedido, estado del pedido</w:t>
+        <w:t xml:space="preserve">El local maneja cada </w:t>
+      </w:r>
+      <w:r>
+        <w:rPr>
+          <w:sz w:val="24"/>
+          <w:szCs w:val="24"/>
+        </w:rPr>
+        <w:t>orden</w:t>
+      </w:r>
+      <w:r>
+        <w:rPr>
+          <w:sz w:val="24"/>
+          <w:szCs w:val="24"/>
+        </w:rPr>
+        <w:t xml:space="preserve"> con un código de identificación único, la hora del pedido, estado del pedido</w:t>
       </w:r>
       <w:r>
         <w:rPr>
@@ -162,7 +176,84 @@
           <w:sz w:val="24"/>
           <w:szCs w:val="24"/>
         </w:rPr>
-        <w:t xml:space="preserve"> y un total de todos los platos. Cada pedido asignara una mesa que cuenta con un numero identificador, capacidad límite de la mesa y un estado de mesa para ocupar o desocupar cada que un cliente va y viene.</w:t>
+        <w:t xml:space="preserve"> y un total de todos los platos.</w:t>
+      </w:r>
+      <w:r>
+        <w:rPr>
+          <w:sz w:val="24"/>
+          <w:szCs w:val="24"/>
+        </w:rPr>
+        <w:t xml:space="preserve"> </w:t>
+      </w:r>
+      <w:r>
+        <w:rPr>
+          <w:sz w:val="24"/>
+          <w:szCs w:val="24"/>
+        </w:rPr>
+        <w:t>Un</w:t>
+      </w:r>
+      <w:r>
+        <w:rPr>
+          <w:sz w:val="24"/>
+          <w:szCs w:val="24"/>
+        </w:rPr>
+        <w:t>a</w:t>
+      </w:r>
+      <w:r>
+        <w:rPr>
+          <w:sz w:val="24"/>
+          <w:szCs w:val="24"/>
+        </w:rPr>
+        <w:t xml:space="preserve"> </w:t>
+      </w:r>
+      <w:r>
+        <w:rPr>
+          <w:sz w:val="24"/>
+          <w:szCs w:val="24"/>
+        </w:rPr>
+        <w:t>orden</w:t>
+      </w:r>
+      <w:r>
+        <w:rPr>
+          <w:sz w:val="24"/>
+          <w:szCs w:val="24"/>
+        </w:rPr>
+        <w:t xml:space="preserve"> cuenta con una lista de cada plato pedido y un plato cuenta con un nombre único, una descripción de ingredientes que lo componen</w:t>
+      </w:r>
+      <w:r>
+        <w:rPr>
+          <w:sz w:val="24"/>
+          <w:szCs w:val="24"/>
+        </w:rPr>
+        <w:t xml:space="preserve"> y </w:t>
+      </w:r>
+      <w:r>
+        <w:rPr>
+          <w:sz w:val="24"/>
+          <w:szCs w:val="24"/>
+        </w:rPr>
+        <w:t>un preci</w:t>
+      </w:r>
+      <w:r>
+        <w:rPr>
+          <w:sz w:val="24"/>
+          <w:szCs w:val="24"/>
+        </w:rPr>
+        <w:t>o</w:t>
+      </w:r>
+      <w:r>
+        <w:rPr>
+          <w:sz w:val="24"/>
+          <w:szCs w:val="24"/>
+        </w:rPr>
+        <w:t xml:space="preserve">. El plato </w:t>
+      </w:r>
+      <w:r>
+        <w:rPr>
+          <w:sz w:val="24"/>
+          <w:szCs w:val="24"/>
+        </w:rPr>
+        <w:t>aparece una vez en la orden, pero aparece con la respectiva cantidad de veces que fue ordenado, si el plato no fue ordenado, no aparece en la orden</w:t>
       </w:r>
     </w:p>
     <w:p>
@@ -178,7 +269,70 @@
           <w:sz w:val="24"/>
           <w:szCs w:val="24"/>
         </w:rPr>
-        <w:t>Un pedido cuenta con una lista de cada plato pedido y un plato cuenta con un nombre único, una descripción de ingredientes que lo componen, un precio y cada uno es parte de una categoría única para el menú. El plato puede ser estar más de una vez en un pedido y terminan conformando el precio total de un pedido entre la suma de todos ellos.</w:t>
+        <w:t>Un empleado del restaurante es identificado con su número de cedula, nombre completo, número de teléfono</w:t>
+      </w:r>
+      <w:r>
+        <w:rPr>
+          <w:sz w:val="24"/>
+          <w:szCs w:val="24"/>
+        </w:rPr>
+        <w:t>, el email y su salario</w:t>
+      </w:r>
+      <w:r>
+        <w:rPr>
+          <w:sz w:val="24"/>
+          <w:szCs w:val="24"/>
+        </w:rPr>
+        <w:t xml:space="preserve">, </w:t>
+      </w:r>
+      <w:r>
+        <w:rPr>
+          <w:sz w:val="24"/>
+          <w:szCs w:val="24"/>
+        </w:rPr>
+        <w:t>cada mesero es asignado a un</w:t>
+      </w:r>
+      <w:r>
+        <w:rPr>
+          <w:sz w:val="24"/>
+          <w:szCs w:val="24"/>
+        </w:rPr>
+        <w:t>a orden</w:t>
+      </w:r>
+      <w:r>
+        <w:rPr>
+          <w:sz w:val="24"/>
+          <w:szCs w:val="24"/>
+        </w:rPr>
+        <w:t xml:space="preserve"> que el atendió o despacho,</w:t>
+      </w:r>
+      <w:r>
+        <w:rPr>
+          <w:sz w:val="24"/>
+          <w:szCs w:val="24"/>
+        </w:rPr>
+        <w:t xml:space="preserve"> el mesero cuenta con</w:t>
+      </w:r>
+      <w:r>
+        <w:rPr>
+          <w:sz w:val="24"/>
+          <w:szCs w:val="24"/>
+        </w:rPr>
+        <w:t xml:space="preserve"> su respectiva zona donde él puede atender</w:t>
+      </w:r>
+      <w:r>
+        <w:rPr>
+          <w:sz w:val="24"/>
+          <w:szCs w:val="24"/>
+        </w:rPr>
+        <w:t>, las zonas son áreas enumeradas para mayor organización</w:t>
+      </w:r>
+      <w:r>
+        <w:rPr>
+          <w:sz w:val="24"/>
+          <w:szCs w:val="24"/>
+        </w:rPr>
+        <w:t>.</w:t>
       </w:r>
     </w:p>
     <w:p>
@@ -194,49 +348,91 @@
           <w:sz w:val="24"/>
           <w:szCs w:val="24"/>
         </w:rPr>
-        <w:t>Un empleado del restaurante es identificado con su número de cedula, nombre completo, número de teléfono</w:t>
-      </w:r>
-      <w:r>
-        <w:rPr>
-          <w:sz w:val="24"/>
-          <w:szCs w:val="24"/>
-        </w:rPr>
-        <w:t>, el email y su salario</w:t>
-      </w:r>
-      <w:r>
-        <w:rPr>
-          <w:sz w:val="24"/>
-          <w:szCs w:val="24"/>
-        </w:rPr>
-        <w:t xml:space="preserve">, </w:t>
-      </w:r>
-      <w:r>
-        <w:rPr>
-          <w:sz w:val="24"/>
-          <w:szCs w:val="24"/>
-        </w:rPr>
-        <w:t>cada mesero es asignado a un pedido que el atendió o despacho,</w:t>
-      </w:r>
-      <w:r>
-        <w:rPr>
-          <w:sz w:val="24"/>
-          <w:szCs w:val="24"/>
-        </w:rPr>
-        <w:t xml:space="preserve"> el mesero cuenta con</w:t>
-      </w:r>
-      <w:r>
-        <w:rPr>
-          <w:sz w:val="24"/>
-          <w:szCs w:val="24"/>
-        </w:rPr>
-        <w:t xml:space="preserve"> su respectiva zona donde él puede atender</w:t>
-      </w:r>
-      <w:r>
-        <w:rPr>
-          <w:sz w:val="24"/>
-          <w:szCs w:val="24"/>
-        </w:rPr>
-        <w:t>.</w:t>
+        <w:t>Para abastecer la cocina, el restaurante trabaja con distintos proveedores, cada uno identificado por su NIT, nombre</w:t>
+      </w:r>
+      <w:r>
+        <w:rPr>
+          <w:sz w:val="24"/>
+          <w:szCs w:val="24"/>
+        </w:rPr>
+        <w:t>,</w:t>
+      </w:r>
+      <w:r>
+        <w:rPr>
+          <w:sz w:val="24"/>
+          <w:szCs w:val="24"/>
+        </w:rPr>
+        <w:t xml:space="preserve"> número de teléfono de contacto</w:t>
+      </w:r>
+      <w:r>
+        <w:rPr>
+          <w:sz w:val="24"/>
+          <w:szCs w:val="24"/>
+        </w:rPr>
+        <w:t xml:space="preserve"> y el email</w:t>
+      </w:r>
+      <w:r>
+        <w:rPr>
+          <w:sz w:val="24"/>
+          <w:szCs w:val="24"/>
+        </w:rPr>
+        <w:t xml:space="preserve">, quienes suministran los insumos utilizados en la preparación de los platos. Cada insumo se </w:t>
+      </w:r>
+      <w:r>
+        <w:rPr>
+          <w:sz w:val="24"/>
+          <w:szCs w:val="24"/>
+        </w:rPr>
+        <w:t>registra</w:t>
+      </w:r>
+      <w:r>
+        <w:rPr>
+          <w:sz w:val="24"/>
+          <w:szCs w:val="24"/>
+        </w:rPr>
+        <w:t xml:space="preserve"> con un </w:t>
+      </w:r>
+      <w:r>
+        <w:rPr>
+          <w:sz w:val="24"/>
+          <w:szCs w:val="24"/>
+        </w:rPr>
+        <w:t xml:space="preserve">identificador único, </w:t>
+      </w:r>
+      <w:r>
+        <w:rPr>
+          <w:sz w:val="24"/>
+          <w:szCs w:val="24"/>
+        </w:rPr>
+        <w:t>nombre, una unidad de medida</w:t>
+      </w:r>
+      <w:r>
+        <w:rPr>
+          <w:sz w:val="24"/>
+          <w:szCs w:val="24"/>
+        </w:rPr>
+        <w:t>,</w:t>
+      </w:r>
+      <w:r>
+        <w:rPr>
+          <w:sz w:val="24"/>
+          <w:szCs w:val="24"/>
+        </w:rPr>
+        <w:t xml:space="preserve"> un stock mínimo establecido</w:t>
+      </w:r>
+      <w:r>
+        <w:rPr>
+          <w:sz w:val="24"/>
+          <w:szCs w:val="24"/>
+        </w:rPr>
+        <w:t xml:space="preserve"> y el stock actual en el inventario</w:t>
+      </w:r>
+      <w:r>
+        <w:rPr>
+          <w:sz w:val="24"/>
+          <w:szCs w:val="24"/>
+        </w:rPr>
+        <w:t>, para mantener un control adecuado del inventario disponible.</w:t>
       </w:r>
     </w:p>
     <w:p>
@@ -252,7 +448,63 @@
           <w:sz w:val="24"/>
           <w:szCs w:val="24"/>
         </w:rPr>
-        <w:t>Cada pedido registra tanto a los empleados que debieron estar involucrados en su horario como al cliente que realizo la orden, y el cliente puede ser anotado como persona jurídica o natural, en caso de persona jurídica se necesita de su nit propio y correo de la empresa al cual llegar la factura, y en caso de persona natural nombre, teléfono y correo personal para hacerle llegar la factura también.</w:t>
+        <w:t xml:space="preserve">El restaurante registra </w:t>
+      </w:r>
+      <w:r>
+        <w:rPr>
+          <w:sz w:val="24"/>
+          <w:szCs w:val="24"/>
+        </w:rPr>
+        <w:t>pedidos</w:t>
+      </w:r>
+      <w:r>
+        <w:rPr>
+          <w:sz w:val="24"/>
+          <w:szCs w:val="24"/>
+        </w:rPr>
+        <w:t xml:space="preserve"> de compra realizadas a un proveedor, cada una con fecha, los insumos solicitados, las cantidades y los precios acordados; al recibirse la mercancía, dicha compra se registra como un movimiento de entrada de inventario, </w:t>
+      </w:r>
+      <w:r>
+        <w:rPr>
+          <w:sz w:val="24"/>
+          <w:szCs w:val="24"/>
+        </w:rPr>
+        <w:t>donde el administrador registra</w:t>
+      </w:r>
+      <w:r>
+        <w:rPr>
+          <w:sz w:val="24"/>
+          <w:szCs w:val="24"/>
+        </w:rPr>
+        <w:t xml:space="preserve"> las existencias disponibles de cada insumo</w:t>
+      </w:r>
+      <w:r>
+        <w:rPr>
+          <w:sz w:val="24"/>
+          <w:szCs w:val="24"/>
+        </w:rPr>
+        <w:t xml:space="preserve"> después del movimiento de entrada</w:t>
+      </w:r>
+      <w:r>
+        <w:rPr>
+          <w:sz w:val="24"/>
+          <w:szCs w:val="24"/>
+        </w:rPr>
+        <w:t>. De forma similar, cada vez que se registra un</w:t>
+      </w:r>
+      <w:r>
+        <w:rPr>
+          <w:sz w:val="24"/>
+          <w:szCs w:val="24"/>
+        </w:rPr>
+        <w:t>a orden</w:t>
+      </w:r>
+      <w:r>
+        <w:rPr>
+          <w:sz w:val="24"/>
+          <w:szCs w:val="24"/>
+        </w:rPr>
+        <w:t>, el sistema descuenta automáticamente del inventario los insumos consumidos según la receta o ficha técnica asociada a cada plato, generando un movimiento de salida. De esta manera queda un historial completo de movimientos de inventario (entradas y salidas) para cada insumo, que permite auditar su uso, detectar mermas y saber cuándo es necesario reabastecer.</w:t>
       </w:r>
     </w:p>
     <w:p>
@@ -268,51 +520,21 @@
           <w:sz w:val="24"/>
           <w:szCs w:val="24"/>
         </w:rPr>
-        <w:t>Para abastecer la cocina, el restaurante trabaja con distintos proveedores, cada uno identificado por su NIT, nombre</w:t>
-      </w:r>
-      <w:r>
-        <w:rPr>
-          <w:sz w:val="24"/>
-          <w:szCs w:val="24"/>
-        </w:rPr>
-        <w:t>,</w:t>
-      </w:r>
-      <w:r>
-        <w:rPr>
-          <w:sz w:val="24"/>
-          <w:szCs w:val="24"/>
-        </w:rPr>
-        <w:t xml:space="preserve"> número de teléfono de contacto</w:t>
-      </w:r>
-      <w:r>
-        <w:rPr>
-          <w:sz w:val="24"/>
-          <w:szCs w:val="24"/>
-        </w:rPr>
-        <w:t xml:space="preserve"> y el email</w:t>
-      </w:r>
-      <w:r>
-        <w:rPr>
-          <w:sz w:val="24"/>
-          <w:szCs w:val="24"/>
-        </w:rPr>
-        <w:t>, quienes suministran los insumos utilizados en la preparación de los platos. Cada insumo se identifica con un nombre, una unidad de medida y un stock mínimo establecido, para mantener un control adecuado del inventario disponible.</w:t>
-      </w:r>
-    </w:p>
-    <w:p>
-      <w:pPr>
-        <w:spacing w:after="150"/>
-        <w:rPr>
-          <w:sz w:val="24"/>
-          <w:szCs w:val="24"/>
-        </w:rPr>
-      </w:pPr>
-      <w:r>
-        <w:rPr>
-          <w:sz w:val="24"/>
-          <w:szCs w:val="24"/>
-        </w:rPr>
-        <w:t xml:space="preserve">El restaurante registra órdenes de compra realizadas a un proveedor, cada una con fecha, los insumos solicitados, las cantidades y los precios acordados; al recibirse la mercancía, dicha compra se registra como un movimiento de entrada de inventario, que actualiza automáticamente las existencias disponibles de cada insumo. De forma similar, cada vez que se registra un pedido, </w:t>
+        <w:t xml:space="preserve">Un empleado, con rol administrativo, es el encargado de registrar los pedidos realizados en el restaurante, de registrar los movimientos de inventario generados </w:t>
+      </w:r>
+      <w:r>
+        <w:rPr>
+          <w:sz w:val="24"/>
+          <w:szCs w:val="24"/>
+        </w:rPr>
+        <w:t>después</w:t>
+      </w:r>
+      <w:r>
+        <w:rPr>
+          <w:sz w:val="24"/>
+          <w:szCs w:val="24"/>
+        </w:rPr>
+        <w:t xml:space="preserve"> de las compras </w:t>
       </w:r>
       <w:r>
         <w:rPr>
@@ -320,23 +542,7 @@
           <w:szCs w:val="24"/>
         </w:rPr>
         <w:lastRenderedPageBreak/>
-        <w:t>el sistema descuenta automáticamente del inventario los insumos consumidos según la receta o ficha técnica asociada a cada plato, generando un movimiento de salida. De esta manera queda un historial completo de movimientos de inventario (entradas y salidas) para cada insumo, que permite auditar su uso, detectar mermas y saber cuándo es necesario reabastecer.</w:t>
-      </w:r>
-    </w:p>
-    <w:p>
-      <w:pPr>
-        <w:spacing w:after="150"/>
-        <w:rPr>
-          <w:sz w:val="24"/>
-          <w:szCs w:val="24"/>
-        </w:rPr>
-      </w:pPr>
-      <w:r>
-        <w:rPr>
-          <w:sz w:val="24"/>
-          <w:szCs w:val="24"/>
-        </w:rPr>
-        <w:t>Un empleado, con rol administrativo, es el encargado de registrar los pedidos realizados en el restaurante, de registrar los movimientos de inventario generados tanto por el consumo de insumos como por la recepción de mercancía, y de registrar las compras realizadas a los proveedores, quedando asociado a cada una de estas operaciones para tener trazabilidad de quién las gestionó.</w:t>
+        <w:t>realizadas a los proveedores, quedando asociado a cada una de estas operaciones para tener trazabilidad de quién las gestionó.</w:t>
       </w:r>
     </w:p>
     <w:p>

</xml_diff>